<commit_message>
Figure 3: draw every pool's ceiling from the pool decomposition data
Co-Authored-By: Claude Opus 5.5 <noreply@anthropic.com>
Claude-Session: https://claude.ai/code/session_01KZ96kvnMzWaL6YRN9b9JVB
</commit_message>
<xml_diff>
--- a/manuscript_v4/benchmark_validity_manuscript_v4.docx
+++ b/manuscript_v4/benchmark_validity_manuscript_v4.docx
@@ -9105,7 +9105,7 @@
       <w:r>
         <w:drawing>
           <wp:inline distT="0" distB="0" distL="0" distR="0">
-            <wp:extent cx="4762500" cy="3000375"/>
+            <wp:extent cx="5715000" cy="2676525"/>
             <wp:effectExtent t="0" r="0" b="0" l="0"/>
             <wp:docPr id="1" name="" descr="" title=""/>
             <wp:cNvGraphicFramePr>
@@ -9130,7 +9130,7 @@
                   <pic:spPr bwMode="auto">
                     <a:xfrm>
                       <a:off x="0" y="0"/>
-                      <a:ext cx="4762500" cy="3000375"/>
+                      <a:ext cx="5715000" cy="2676525"/>
                     </a:xfrm>
                     <a:prstGeom prst="rect">
                       <a:avLst/>
@@ -9166,7 +9166,7 @@
           <w:sz w:val="19"/>
           <w:szCs w:val="19"/>
         </w:rPr>
-        <w:t xml:space="preserve">Generator B agreement with clinical references against measured background texture, over all 32 methods (black line) and over the original 22 (open triangle). The two clinical-to-clinical values coincide and are drawn as one line.</w:t>
+        <w:t xml:space="preserve">Generator B agreement with two clinical references at three texture amplitudes, for each method pool (mean and standard deviation over three seeds). Each horizontal line is the clinical-to-clinical ceiling for the pool in the same shade, labelled with its value; the percentage marks the best amplitude as a share of that pool's own ceiling.</w:t>
       </w:r>
     </w:p>
     <w:p>
@@ -11824,7 +11824,7 @@
         </w:rPr>
         <w:t xml:space="preserve">Alajmi, A., Elnahal, Y., Othman, M., Aljuhani, M., Alharbi, A., Abdelhady, G., 2026. A systematic multi-dataset, multi-seed evaluation of preprocessing strategies for retinal optic disc and cup segmentation. Diagnostics 16(17), 2880. </w:t>
       </w:r>
-      <w:hyperlink w:history="1" r:id="rId0gt9awtfratsmwl0xuqwh">
+      <w:hyperlink w:history="1" r:id="rIdo8kug1eqyzlzvffy4fqnq">
         <w:r>
           <w:rPr>
             <w:rFonts w:ascii="Times New Roman" w:cs="Times New Roman" w:eastAsia="Times New Roman" w:hAnsi="Times New Roman"/>
@@ -11852,7 +11852,7 @@
         </w:rPr>
         <w:t xml:space="preserve">Alfano, B., Comerci, M., Larobina, M., et al., 2011. An MRI digital brain phantom for validation of segmentation methods. Medical Image Analysis 15(3), 329-339. </w:t>
       </w:r>
-      <w:hyperlink w:history="1" r:id="rId7p5m4sy-mrrq3rq4tordx">
+      <w:hyperlink w:history="1" r:id="rIdbzxgun8-etztwpdjhz0hs">
         <w:r>
           <w:rPr>
             <w:rFonts w:ascii="Times New Roman" w:cs="Times New Roman" w:eastAsia="Times New Roman" w:hAnsi="Times New Roman"/>
@@ -11880,7 +11880,7 @@
         </w:rPr>
         <w:t xml:space="preserve">Ali, S., Ghatwary, N., Jha, D., et al., 2024. Assessing generalisability of deep learning-based polyp detection and segmentation methods through a computer vision challenge. Scientific Reports 14, 2032. </w:t>
       </w:r>
-      <w:hyperlink w:history="1" r:id="rIdnrhbv7wluav0vmj1_x1cy">
+      <w:hyperlink w:history="1" r:id="rIdgqixpc_smdjljb_bfhcrw">
         <w:r>
           <w:rPr>
             <w:rFonts w:ascii="Times New Roman" w:cs="Times New Roman" w:eastAsia="Times New Roman" w:hAnsi="Times New Roman"/>
@@ -11908,7 +11908,7 @@
         </w:rPr>
         <w:t xml:space="preserve">Antonelli, M., Reinke, A., Bakas, S., et al., 2022. The Medical Segmentation Decathlon. Nature Communications 13, 4128. </w:t>
       </w:r>
-      <w:hyperlink w:history="1" r:id="rIdaj7jdk1egfnkpyr9fmb-g">
+      <w:hyperlink w:history="1" r:id="rIdopq4u7fdeksbdgjxcnwwy">
         <w:r>
           <w:rPr>
             <w:rFonts w:ascii="Times New Roman" w:cs="Times New Roman" w:eastAsia="Times New Roman" w:hAnsi="Times New Roman"/>
@@ -11936,7 +11936,7 @@
         </w:rPr>
         <w:t xml:space="preserve">Badano, A., Graff, C.G., Badal, A., et al., 2018. Evaluation of digital breast tomosynthesis as replacement of full-field digital mammography using an in silico imaging trial. JAMA Network Open 1(7), e185474. </w:t>
       </w:r>
-      <w:hyperlink w:history="1" r:id="rIdhs3cci1pziexheimkalzh">
+      <w:hyperlink w:history="1" r:id="rIdurw6luqyj7w7qdicklowb">
         <w:r>
           <w:rPr>
             <w:rFonts w:ascii="Times New Roman" w:cs="Times New Roman" w:eastAsia="Times New Roman" w:hAnsi="Times New Roman"/>
@@ -11964,7 +11964,7 @@
         </w:rPr>
         <w:t xml:space="preserve">Baek, C., Jiang, Y., Raghunathan, A., Kolter, J.Z., 2022. Agreement-on-the-line: Predicting the performance of neural networks under distribution shift. In: Advances in Neural Information Processing Systems 35 (NeurIPS 2022), pp. 19274-19289. </w:t>
       </w:r>
-      <w:hyperlink w:history="1" r:id="rIdiwnqh8kqds_xt5d_1ju73">
+      <w:hyperlink w:history="1" r:id="rIdlc8i-g8idhigyqkaiwsa0">
         <w:r>
           <w:rPr>
             <w:rFonts w:ascii="Times New Roman" w:cs="Times New Roman" w:eastAsia="Times New Roman" w:hAnsi="Times New Roman"/>
@@ -11992,7 +11992,7 @@
         </w:rPr>
         <w:t xml:space="preserve">Basiri, R., Manji, K., Harton, F., Poonja, A., Popovic, M.R., Khan, S.S., 2023. Synthesizing diabetic foot ulcer images with diffusion model. arXiv preprint. </w:t>
       </w:r>
-      <w:hyperlink w:history="1" r:id="rId3d9n3fkav7wukhzs4g7eb">
+      <w:hyperlink w:history="1" r:id="rId7-d9mksdigs3qhsfyme21">
         <w:r>
           <w:rPr>
             <w:rFonts w:ascii="Times New Roman" w:cs="Times New Roman" w:eastAsia="Times New Roman" w:hAnsi="Times New Roman"/>
@@ -12020,7 +12020,7 @@
         </w:rPr>
         <w:t xml:space="preserve">Bassi, P.R.A.S., Li, W., Tang, Y., et al., 2024. Touchstone benchmark: Are we on the right way for evaluating AI algorithms for medical segmentation? In: Advances in Neural Information Processing Systems 37 (NeurIPS 2024), Datasets and Benchmarks Track. </w:t>
       </w:r>
-      <w:hyperlink w:history="1" r:id="rIdpfcemge3l6fx-wd-lt-de">
+      <w:hyperlink w:history="1" r:id="rIdn-n_9fwzomj8ct1q7bpo3">
         <w:r>
           <w:rPr>
             <w:rFonts w:ascii="Times New Roman" w:cs="Times New Roman" w:eastAsia="Times New Roman" w:hAnsi="Times New Roman"/>
@@ -12048,7 +12048,7 @@
         </w:rPr>
         <w:t xml:space="preserve">Benfatah, A., 2026. Do diabetic foot ulcer segmentation models generalize? A cross-dataset benchmark of CNN and transformer architectures. arXiv preprint. </w:t>
       </w:r>
-      <w:hyperlink w:history="1" r:id="rIdmrajkkarube9nibxvn_4o">
+      <w:hyperlink w:history="1" r:id="rId0cqzg-k9oxpyuo0jjx3b4">
         <w:r>
           <w:rPr>
             <w:rFonts w:ascii="Times New Roman" w:cs="Times New Roman" w:eastAsia="Times New Roman" w:hAnsi="Times New Roman"/>
@@ -12076,7 +12076,7 @@
         </w:rPr>
         <w:t xml:space="preserve">Bernal, J., Sánchez, J., Vilariño, F., 2012. Towards automatic polyp detection with a polyp appearance model. Pattern Recognition 45(9), 3166-3182. </w:t>
       </w:r>
-      <w:hyperlink w:history="1" r:id="rIdxdji1y64asoufw6xmmruu">
+      <w:hyperlink w:history="1" r:id="rIdjmnmckzd35qfneoylda9s">
         <w:r>
           <w:rPr>
             <w:rFonts w:ascii="Times New Roman" w:cs="Times New Roman" w:eastAsia="Times New Roman" w:hAnsi="Times New Roman"/>
@@ -12104,7 +12104,7 @@
         </w:rPr>
         <w:t xml:space="preserve">Bernal, J., Sánchez, F.J., Fernández-Esparrach, G., Gil, D., Rodríguez, C., Vilariño, F., 2015. WM-DOVA maps for accurate polyp highlighting in colonoscopy: Validation vs. saliency maps from physicians. Computerized Medical Imaging and Graphics 43, 99-111. </w:t>
       </w:r>
-      <w:hyperlink w:history="1" r:id="rIdj-wdjmuub3bi4ljt3olqu">
+      <w:hyperlink w:history="1" r:id="rId-dximzayj9cty_xxrymca">
         <w:r>
           <w:rPr>
             <w:rFonts w:ascii="Times New Roman" w:cs="Times New Roman" w:eastAsia="Times New Roman" w:hAnsi="Times New Roman"/>
@@ -12132,7 +12132,7 @@
         </w:rPr>
         <w:t xml:space="preserve">Billot, B., Greve, D.N., Puonti, O., et al., 2023. SynthSeg: Segmentation of brain MRI scans of any contrast and resolution without retraining. Medical Image Analysis 86, 102789. </w:t>
       </w:r>
-      <w:hyperlink w:history="1" r:id="rIdlo83rcyqb1fcjtr77thbq">
+      <w:hyperlink w:history="1" r:id="rIdootzqky9ys8qvv3spbe0m">
         <w:r>
           <w:rPr>
             <w:rFonts w:ascii="Times New Roman" w:cs="Times New Roman" w:eastAsia="Times New Roman" w:hAnsi="Times New Roman"/>
@@ -12160,7 +12160,7 @@
         </w:rPr>
         <w:t xml:space="preserve">Borsukiewicz, P., Lunghi, D., Ouédraogo, W.C., Klein, J., Bissyandé, T.F., 2026. Benchmarking face recognition without real faces. arXiv preprint. </w:t>
       </w:r>
-      <w:hyperlink w:history="1" r:id="rIdbxzajsrif-zkuerq4em2x">
+      <w:hyperlink w:history="1" r:id="rIddxyiqvvelivk7eimsbvaw">
         <w:r>
           <w:rPr>
             <w:rFonts w:ascii="Times New Roman" w:cs="Times New Roman" w:eastAsia="Times New Roman" w:hAnsi="Times New Roman"/>
@@ -12188,7 +12188,7 @@
         </w:rPr>
         <w:t xml:space="preserve">Castro, D.C., Walker, I., Glocker, B., 2020. Causality matters in medical imaging. Nature Communications 11, 3673. </w:t>
       </w:r>
-      <w:hyperlink w:history="1" r:id="rIdkmhlebukivouuqhag9gqk">
+      <w:hyperlink w:history="1" r:id="rIdghw9s_s-8imw9gtv5jneb">
         <w:r>
           <w:rPr>
             <w:rFonts w:ascii="Times New Roman" w:cs="Times New Roman" w:eastAsia="Times New Roman" w:hAnsi="Times New Roman"/>
@@ -12216,7 +12216,7 @@
         </w:rPr>
         <w:t xml:space="preserve">Chaurasia, A., Culurciello, E., 2017. LinkNet: Exploiting encoder representations for efficient semantic segmentation. In: 2017 IEEE Visual Communications and Image Processing (VCIP), pp. 1-4. </w:t>
       </w:r>
-      <w:hyperlink w:history="1" r:id="rIdf73bjlk7o7la2jqutszer">
+      <w:hyperlink w:history="1" r:id="rIdd0e416mvxjnci3zg_irig">
         <w:r>
           <w:rPr>
             <w:rFonts w:ascii="Times New Roman" w:cs="Times New Roman" w:eastAsia="Times New Roman" w:hAnsi="Times New Roman"/>
@@ -12244,7 +12244,7 @@
         </w:rPr>
         <w:t xml:space="preserve">Chen, L.-C., Zhu, Y., Papandreou, G., Schroff, F., Adam, H., 2018. Encoder-decoder with atrous separable convolution for semantic image segmentation. In: Computer Vision, ECCV 2018. Lecture Notes in Computer Science 11211, pp. 833-851. </w:t>
       </w:r>
-      <w:hyperlink w:history="1" r:id="rIdqqxgbqajwv-qy-fxqfsqc">
+      <w:hyperlink w:history="1" r:id="rIdbixbngxo3whmz2xfcvsyq">
         <w:r>
           <w:rPr>
             <w:rFonts w:ascii="Times New Roman" w:cs="Times New Roman" w:eastAsia="Times New Roman" w:hAnsi="Times New Roman"/>
@@ -12272,7 +12272,7 @@
         </w:rPr>
         <w:t xml:space="preserve">Chen, R.J., Lu, M.Y., Chen, T.Y., Williamson, D.F.K., Mahmood, F., 2021. Synthetic data in machine learning for medicine and healthcare. Nature Biomedical Engineering 5(6), 493-497. </w:t>
       </w:r>
-      <w:hyperlink w:history="1" r:id="rId4d-0hsj-fcse1vyp2kjgx">
+      <w:hyperlink w:history="1" r:id="rIdhjxqsqthwo96w5tgj5zb-">
         <w:r>
           <w:rPr>
             <w:rFonts w:ascii="Times New Roman" w:cs="Times New Roman" w:eastAsia="Times New Roman" w:hAnsi="Times New Roman"/>
@@ -12300,7 +12300,7 @@
         </w:rPr>
         <w:t xml:space="preserve">Collins, D.L., Zijdenbos, A.P., Kollokian, V., et al., 1998. Design and construction of a realistic digital brain phantom. IEEE Transactions on Medical Imaging 17(3), 463-468. </w:t>
       </w:r>
-      <w:hyperlink w:history="1" r:id="rIdewgoqa7uqa-ifbpwnllu_">
+      <w:hyperlink w:history="1" r:id="rIdnh6dm6jpo1-k0kbth-aiu">
         <w:r>
           <w:rPr>
             <w:rFonts w:ascii="Times New Roman" w:cs="Times New Roman" w:eastAsia="Times New Roman" w:hAnsi="Times New Roman"/>
@@ -12328,7 +12328,7 @@
         </w:rPr>
         <w:t xml:space="preserve">Deo, Y., Jia, Y., Lassila, T., et al., 2025. Metrics that matter: Evaluating image quality metrics for medical image generation. arXiv preprint. </w:t>
       </w:r>
-      <w:hyperlink w:history="1" r:id="rIdi8nbzrvrbhsaxzthhlau-">
+      <w:hyperlink w:history="1" r:id="rIdagycqcejniznsxp2wknm9">
         <w:r>
           <w:rPr>
             <w:rFonts w:ascii="Times New Roman" w:cs="Times New Roman" w:eastAsia="Times New Roman" w:hAnsi="Times New Roman"/>
@@ -12356,7 +12356,7 @@
         </w:rPr>
         <w:t xml:space="preserve">Dominguez-Olmedo, R., Dorner, F.E., Hardt, M., 2025. Training on the test task confounds evaluation and emergence. In: International Conference on Learning Representations (ICLR 2025). </w:t>
       </w:r>
-      <w:hyperlink w:history="1" r:id="rId6a3f4ppxg1j5pgzms2prd">
+      <w:hyperlink w:history="1" r:id="rIdastqb9qhi5hgroma1wekb">
         <w:r>
           <w:rPr>
             <w:rFonts w:ascii="Times New Roman" w:cs="Times New Roman" w:eastAsia="Times New Roman" w:hAnsi="Times New Roman"/>
@@ -12384,7 +12384,7 @@
         </w:rPr>
         <w:t xml:space="preserve">Eisenmann, M., Reinke, A., Weru, V., et al., 2023. Why is the winner the best? In: Proceedings of the IEEE/CVF Conference on Computer Vision and Pattern Recognition (CVPR 2023), pp. 19955-19966. </w:t>
       </w:r>
-      <w:hyperlink w:history="1" r:id="rIdebwnr6rdodqv2-6gkaqtv">
+      <w:hyperlink w:history="1" r:id="rIddd-gsgpb_vbwtu5e0sbaq">
         <w:r>
           <w:rPr>
             <w:rFonts w:ascii="Times New Roman" w:cs="Times New Roman" w:eastAsia="Times New Roman" w:hAnsi="Times New Roman"/>
@@ -12412,7 +12412,7 @@
         </w:rPr>
         <w:t xml:space="preserve">Fan, T., Wang, G., Li, Y., Wang, H., 2020. MA-Net: A multi-scale attention network for liver and tumor segmentation. IEEE Access 8, 179656-179665. </w:t>
       </w:r>
-      <w:hyperlink w:history="1" r:id="rIdmu6mwmhbduubuqbmmbepq">
+      <w:hyperlink w:history="1" r:id="rIdhbuiqqhfbxwjcvvgq3iw7">
         <w:r>
           <w:rPr>
             <w:rFonts w:ascii="Times New Roman" w:cs="Times New Roman" w:eastAsia="Times New Roman" w:hAnsi="Times New Roman"/>
@@ -12440,7 +12440,7 @@
         </w:rPr>
         <w:t xml:space="preserve">Geirhos, R., Jacobsen, J.-H., Michaelis, C., et al., 2020. Shortcut learning in deep neural networks. Nature Machine Intelligence 2(11), 665-673. </w:t>
       </w:r>
-      <w:hyperlink w:history="1" r:id="rIdebbbp-fege7q527ntios0">
+      <w:hyperlink w:history="1" r:id="rIdwalyype_7ertuib_ulqdx">
         <w:r>
           <w:rPr>
             <w:rFonts w:ascii="Times New Roman" w:cs="Times New Roman" w:eastAsia="Times New Roman" w:hAnsi="Times New Roman"/>
@@ -12468,7 +12468,7 @@
         </w:rPr>
         <w:t xml:space="preserve">Gong, H., Chen, G., Wang, R., et al., 2021. Multi-task learning for thyroid nodule segmentation with thyroid region prior. In: 2021 IEEE 18th International Symposium on Biomedical Imaging (ISBI), pp. 257-261. </w:t>
       </w:r>
-      <w:hyperlink w:history="1" r:id="rIdkp_lw7y40sohb2t0t9d-8">
+      <w:hyperlink w:history="1" r:id="rIdtsiquochx1na8vbeyozqc">
         <w:r>
           <w:rPr>
             <w:rFonts w:ascii="Times New Roman" w:cs="Times New Roman" w:eastAsia="Times New Roman" w:hAnsi="Times New Roman"/>
@@ -12496,7 +12496,7 @@
         </w:rPr>
         <w:t xml:space="preserve">He, K., Zhang, X., Ren, S., Sun, J., 2016. Deep residual learning for image recognition. In: Proceedings of the IEEE Conference on Computer Vision and Pattern Recognition (CVPR), pp. 770-778. </w:t>
       </w:r>
-      <w:hyperlink w:history="1" r:id="rIdsuu9kyvtxe6l0ybfned28">
+      <w:hyperlink w:history="1" r:id="rIddz2ggynmo1yatlgj19-pk">
         <w:r>
           <w:rPr>
             <w:rFonts w:ascii="Times New Roman" w:cs="Times New Roman" w:eastAsia="Times New Roman" w:hAnsi="Times New Roman"/>
@@ -12524,7 +12524,7 @@
         </w:rPr>
         <w:t xml:space="preserve">Iakubovskii, P., 2019. Segmentation Models Pytorch. GitHub repository. </w:t>
       </w:r>
-      <w:hyperlink w:history="1" r:id="rIdlqd-41y5_8cj5fgget1tk">
+      <w:hyperlink w:history="1" r:id="rIdwtiavb9ceki1sxunmblrd">
         <w:r>
           <w:rPr>
             <w:rFonts w:ascii="Times New Roman" w:cs="Times New Roman" w:eastAsia="Times New Roman" w:hAnsi="Times New Roman"/>
@@ -12552,7 +12552,7 @@
         </w:rPr>
         <w:t xml:space="preserve">Isensee, F., Jaeger, P.F., Kohl, S.A.A., Petersen, J., Maier-Hein, K.H., 2021. nnU-Net: A self-configuring method for deep learning-based biomedical image segmentation. Nature Methods 18(2), 203-211. </w:t>
       </w:r>
-      <w:hyperlink w:history="1" r:id="rIdcdbux8efpk91ijghpeh4m">
+      <w:hyperlink w:history="1" r:id="rIdcyga7-kafhjsrvwur_72y">
         <w:r>
           <w:rPr>
             <w:rFonts w:ascii="Times New Roman" w:cs="Times New Roman" w:eastAsia="Times New Roman" w:hAnsi="Times New Roman"/>
@@ -12580,7 +12580,7 @@
         </w:rPr>
         <w:t xml:space="preserve">Isensee, F., Wald, T., Ulrich, C., et al., 2024. nnU-Net revisited: A call for rigorous validation in 3D medical image segmentation. In: Medical Image Computing and Computer Assisted Intervention, MICCAI 2024. Lecture Notes in Computer Science 15009, pp. 488-498. </w:t>
       </w:r>
-      <w:hyperlink w:history="1" r:id="rIdhzadxlbq-gmjbbas1j1lc">
+      <w:hyperlink w:history="1" r:id="rIdfui0fsvk0gcos5jgwyzo-">
         <w:r>
           <w:rPr>
             <w:rFonts w:ascii="Times New Roman" w:cs="Times New Roman" w:eastAsia="Times New Roman" w:hAnsi="Times New Roman"/>
@@ -12608,7 +12608,7 @@
         </w:rPr>
         <w:t xml:space="preserve">Jha, D., Smedsrud, P.H., Riegler, M.A., Halvorsen, P., de Lange, T., Johansen, D., Johansen, H.D., 2020. Kvasir-SEG: A segmented polyp dataset. In: MultiMedia Modeling, MMM 2020. Lecture Notes in Computer Science 11962, pp. 451-462. </w:t>
       </w:r>
-      <w:hyperlink w:history="1" r:id="rId02p-odp0tqmvylmaohlct">
+      <w:hyperlink w:history="1" r:id="rId_hpqn2pjjmu3ca02lwftx">
         <w:r>
           <w:rPr>
             <w:rFonts w:ascii="Times New Roman" w:cs="Times New Roman" w:eastAsia="Times New Roman" w:hAnsi="Times New Roman"/>
@@ -12636,7 +12636,7 @@
         </w:rPr>
         <w:t xml:space="preserve">Kang, C., 2022. Is synthetic dataset reliable for benchmarking generalizable person re-identification? arXiv preprint. </w:t>
       </w:r>
-      <w:hyperlink w:history="1" r:id="rId_845cuijkfxwcmnuurjzj">
+      <w:hyperlink w:history="1" r:id="rId8daws0xn6f9plt-infznc">
         <w:r>
           <w:rPr>
             <w:rFonts w:ascii="Times New Roman" w:cs="Times New Roman" w:eastAsia="Times New Roman" w:hAnsi="Times New Roman"/>
@@ -12664,7 +12664,7 @@
         </w:rPr>
         <w:t xml:space="preserve">Kendrick, C., Cassidy, B., Pappachan, J.M., et al., 2022. Translating clinical delineation of diabetic foot ulcers into machine interpretable segmentation. arXiv preprint. </w:t>
       </w:r>
-      <w:hyperlink w:history="1" r:id="rIdgswxxxaoxqb3yo_kn7oue">
+      <w:hyperlink w:history="1" r:id="rIdgp4lot9sfg_heimxdaruv">
         <w:r>
           <w:rPr>
             <w:rFonts w:ascii="Times New Roman" w:cs="Times New Roman" w:eastAsia="Times New Roman" w:hAnsi="Times New Roman"/>
@@ -12692,7 +12692,7 @@
         </w:rPr>
         <w:t xml:space="preserve">Lin, T.-Y., Dollár, P., Girshick, R., He, K., Hariharan, B., Belongie, S., 2017. Feature pyramid networks for object detection. In: Proceedings of the IEEE Conference on Computer Vision and Pattern Recognition (CVPR), pp. 936-944. </w:t>
       </w:r>
-      <w:hyperlink w:history="1" r:id="rId61j3n9fhul8fs_rft-cqp">
+      <w:hyperlink w:history="1" r:id="rIdk2i881in_fkuro7x-z-6q">
         <w:r>
           <w:rPr>
             <w:rFonts w:ascii="Times New Roman" w:cs="Times New Roman" w:eastAsia="Times New Roman" w:hAnsi="Times New Roman"/>
@@ -12720,7 +12720,7 @@
         </w:rPr>
         <w:t xml:space="preserve">Liu, B., Dolz, J., Galdran, A., Kobbi, R., Ben Ayed, I., 2024. Do we really need Dice? The hidden region-size biases of segmentation losses. Medical Image Analysis 91, 103015. </w:t>
       </w:r>
-      <w:hyperlink w:history="1" r:id="rId8q0ekplmrhhuwrx-jcsof">
+      <w:hyperlink w:history="1" r:id="rIdi3lcddjznyaz_efm9ir6u">
         <w:r>
           <w:rPr>
             <w:rFonts w:ascii="Times New Roman" w:cs="Times New Roman" w:eastAsia="Times New Roman" w:hAnsi="Times New Roman"/>
@@ -12748,7 +12748,7 @@
         </w:rPr>
         <w:t xml:space="preserve">Lucho, S., Naemi, R., Castaneda, B., Treuillet, S., 2024. Can deep learning wound segmentation algorithms developed for a dataset be effective for another dataset? A specific focus on diabetic foot ulcers. IEEE Access 12, 173824-173835. </w:t>
       </w:r>
-      <w:hyperlink w:history="1" r:id="rIdvinu-trtk8nyc0gbbjrex">
+      <w:hyperlink w:history="1" r:id="rId3mjevtsbpni4bb79cxcef">
         <w:r>
           <w:rPr>
             <w:rFonts w:ascii="Times New Roman" w:cs="Times New Roman" w:eastAsia="Times New Roman" w:hAnsi="Times New Roman"/>
@@ -12776,7 +12776,7 @@
         </w:rPr>
         <w:t xml:space="preserve">Maheshwari, G., Ivanov, D., El Haddad, K., 2024. Efficacy of synthetic data as a benchmark. arXiv preprint. </w:t>
       </w:r>
-      <w:hyperlink w:history="1" r:id="rIdblz-wzzszfgpmuf52omna">
+      <w:hyperlink w:history="1" r:id="rId8tleuggd8dvuxonvifrkp">
         <w:r>
           <w:rPr>
             <w:rFonts w:ascii="Times New Roman" w:cs="Times New Roman" w:eastAsia="Times New Roman" w:hAnsi="Times New Roman"/>
@@ -12804,7 +12804,7 @@
         </w:rPr>
         <w:t xml:space="preserve">Maier-Hein, L., Eisenmann, M., Reinke, A., et al., 2018. Why rankings of biomedical image analysis competitions should be interpreted with care. Nature Communications 9, 5217. </w:t>
       </w:r>
-      <w:hyperlink w:history="1" r:id="rIdq2a_kiupxjjuwxlffyf0v">
+      <w:hyperlink w:history="1" r:id="rIdsiav411ctfjnxi3uk7w0q">
         <w:r>
           <w:rPr>
             <w:rFonts w:ascii="Times New Roman" w:cs="Times New Roman" w:eastAsia="Times New Roman" w:hAnsi="Times New Roman"/>
@@ -12832,7 +12832,7 @@
         </w:rPr>
         <w:t xml:space="preserve">Maier-Hein, L., Reinke, A., Kozubek, M., et al., 2020. BIAS: Transparent reporting of biomedical image analysis challenges. Medical Image Analysis 66, 101796. </w:t>
       </w:r>
-      <w:hyperlink w:history="1" r:id="rIdf_zvr-otogb8eftftvism">
+      <w:hyperlink w:history="1" r:id="rIdnbhvdkfi0y7n-ytyvyuhp">
         <w:r>
           <w:rPr>
             <w:rFonts w:ascii="Times New Roman" w:cs="Times New Roman" w:eastAsia="Times New Roman" w:hAnsi="Times New Roman"/>
@@ -12860,7 +12860,7 @@
         </w:rPr>
         <w:t xml:space="preserve">Maier-Hein, L., Reinke, A., Godau, P., et al., 2024. Metrics reloaded: Recommendations for image analysis validation. Nature Methods 21(2), 195-212. </w:t>
       </w:r>
-      <w:hyperlink w:history="1" r:id="rIdxyqqfowss4qlf7bnbstvl">
+      <w:hyperlink w:history="1" r:id="rIdqxw4rmptkai4qmco-gf4o">
         <w:r>
           <w:rPr>
             <w:rFonts w:ascii="Times New Roman" w:cs="Times New Roman" w:eastAsia="Times New Roman" w:hAnsi="Times New Roman"/>
@@ -12888,7 +12888,7 @@
         </w:rPr>
         <w:t xml:space="preserve">Medetec, 2014. Medetec wound database: medical image databases. Web resource, accessed 8 October 2026. </w:t>
       </w:r>
-      <w:hyperlink w:history="1" r:id="rIdv0nlbxp63rjwokhekx-zp">
+      <w:hyperlink w:history="1" r:id="rId2dcqy03pstamfnkdcrkli">
         <w:r>
           <w:rPr>
             <w:rFonts w:ascii="Times New Roman" w:cs="Times New Roman" w:eastAsia="Times New Roman" w:hAnsi="Times New Roman"/>
@@ -12916,7 +12916,7 @@
         </w:rPr>
         <w:t xml:space="preserve">Mendonça, T., Ferreira, P.M., Marques, J.S., Marçal, A.R.S., Rozeira, J., 2013. PH2: A dermoscopic image database for research and benchmarking. In: 2013 35th Annual International Conference of the IEEE Engineering in Medicine and Biology Society (EMBC), pp. 5437-5440. </w:t>
       </w:r>
-      <w:hyperlink w:history="1" r:id="rIdta6jc331ulavk7sbgkl5a">
+      <w:hyperlink w:history="1" r:id="rIdow_i4jna75i1c_irzbu6n">
         <w:r>
           <w:rPr>
             <w:rFonts w:ascii="Times New Roman" w:cs="Times New Roman" w:eastAsia="Times New Roman" w:hAnsi="Times New Roman"/>
@@ -12944,7 +12944,7 @@
         </w:rPr>
         <w:t xml:space="preserve">Miller, J.P., Taori, R., Raghunathan, A., et al., 2021. Accuracy on the line: On the strong correlation between out-of-distribution and in-distribution generalization. In: Proceedings of the 38th International Conference on Machine Learning (ICML 2021), PMLR 139, pp. 7721-7735. </w:t>
       </w:r>
-      <w:hyperlink w:history="1" r:id="rIdpvciuk80r7lzfww2utie_">
+      <w:hyperlink w:history="1" r:id="rIdwnie3tcyvwpb8ea4o2khs">
         <w:r>
           <w:rPr>
             <w:rFonts w:ascii="Times New Roman" w:cs="Times New Roman" w:eastAsia="Times New Roman" w:hAnsi="Times New Roman"/>
@@ -12972,7 +12972,7 @@
         </w:rPr>
         <w:t xml:space="preserve">Nikolov, S., Blackwell, S., Zverovitch, A., et al., 2018. Deep learning to achieve clinically applicable segmentation of head and neck anatomy for radiotherapy. arXiv preprint. </w:t>
       </w:r>
-      <w:hyperlink w:history="1" r:id="rIdcncjynujgbozkrsyyp4ud">
+      <w:hyperlink w:history="1" r:id="rIdukcma7hiss2z2vr1rm7lu">
         <w:r>
           <w:rPr>
             <w:rFonts w:ascii="Times New Roman" w:cs="Times New Roman" w:eastAsia="Times New Roman" w:hAnsi="Times New Roman"/>
@@ -13000,7 +13000,7 @@
         </w:rPr>
         <w:t xml:space="preserve">Nikolov, S., Blackwell, S., Zverovitch, A., et al., 2021. Clinically applicable segmentation of head and neck anatomy for radiotherapy: Deep learning algorithm development and validation study. Journal of Medical Internet Research 23(7), e26151. </w:t>
       </w:r>
-      <w:hyperlink w:history="1" r:id="rIdtyxbcdgxg96txrpf6xinr">
+      <w:hyperlink w:history="1" r:id="rIdv1h7up1vs0iec4gbp6pmj">
         <w:r>
           <w:rPr>
             <w:rFonts w:ascii="Times New Roman" w:cs="Times New Roman" w:eastAsia="Times New Roman" w:hAnsi="Times New Roman"/>
@@ -13028,7 +13028,7 @@
         </w:rPr>
         <w:t xml:space="preserve">Perlitz, Y., Gera, A., Arviv, O., et al., 2024. Do these LLM benchmarks agree? Fixing benchmark evaluation with BenchBench. arXiv preprint. </w:t>
       </w:r>
-      <w:hyperlink w:history="1" r:id="rIda6bcl3e7l-ownme-11ehv">
+      <w:hyperlink w:history="1" r:id="rIdcsch4bvjhjr9icd-l0efn">
         <w:r>
           <w:rPr>
             <w:rFonts w:ascii="Times New Roman" w:cs="Times New Roman" w:eastAsia="Times New Roman" w:hAnsi="Times New Roman"/>
@@ -13056,7 +13056,7 @@
         </w:rPr>
         <w:t xml:space="preserve">Piérard, S., Deliège, A., Halin, A., Van Droogenbroeck, M., 2025. A methodology to evaluate strategies predicting rankings on unseen domains. arXiv preprint. </w:t>
       </w:r>
-      <w:hyperlink w:history="1" r:id="rId840kwopqmwyzbrzfhsto9">
+      <w:hyperlink w:history="1" r:id="rId1zshzvgky1wvfklaci4ij">
         <w:r>
           <w:rPr>
             <w:rFonts w:ascii="Times New Roman" w:cs="Times New Roman" w:eastAsia="Times New Roman" w:hAnsi="Times New Roman"/>
@@ -13084,7 +13084,7 @@
         </w:rPr>
         <w:t xml:space="preserve">Prakash, A., Boochoon, S., Brophy, M., et al., 2019. Structured domain randomization: Bridging the reality gap by context-aware synthetic data. In: 2019 International Conference on Robotics and Automation (ICRA). </w:t>
       </w:r>
-      <w:hyperlink w:history="1" r:id="rIdw-jvidiswjlt0rnuhwybj">
+      <w:hyperlink w:history="1" r:id="rIdzh1zqagbxcxzgur_jzi3d">
         <w:r>
           <w:rPr>
             <w:rFonts w:ascii="Times New Roman" w:cs="Times New Roman" w:eastAsia="Times New Roman" w:hAnsi="Times New Roman"/>
@@ -13112,7 +13112,7 @@
         </w:rPr>
         <w:t xml:space="preserve">Raina, V., Molchanova, N., Graziani, M., et al., 2023. Tackling bias in the Dice similarity coefficient: Introducing nDSC for white matter lesion segmentation. In: IEEE International Symposium on Biomedical Imaging (ISBI 2023), pp. 1-5. </w:t>
       </w:r>
-      <w:hyperlink w:history="1" r:id="rIdhdfzazzth0enlyoe6drwt">
+      <w:hyperlink w:history="1" r:id="rIdse-cbtppu3r7mopcottib">
         <w:r>
           <w:rPr>
             <w:rFonts w:ascii="Times New Roman" w:cs="Times New Roman" w:eastAsia="Times New Roman" w:hAnsi="Times New Roman"/>
@@ -13140,7 +13140,7 @@
         </w:rPr>
         <w:t xml:space="preserve">Recht, B., Roelofs, R., Schmidt, L., Shankar, V., 2019. Do ImageNet classifiers generalize to ImageNet? In: Proceedings of the 36th International Conference on Machine Learning (ICML 2019), PMLR 97, pp. 5389-5400. </w:t>
       </w:r>
-      <w:hyperlink w:history="1" r:id="rIdqchqo-jqw8higej6e8xkp">
+      <w:hyperlink w:history="1" r:id="rIdu53-quuc-onqne1a1-rxg">
         <w:r>
           <w:rPr>
             <w:rFonts w:ascii="Times New Roman" w:cs="Times New Roman" w:eastAsia="Times New Roman" w:hAnsi="Times New Roman"/>
@@ -13168,7 +13168,7 @@
         </w:rPr>
         <w:t xml:space="preserve">Reinke, A., Tizabi, M.D., Baumgartner, M., et al., 2024. Understanding metric-related pitfalls in image analysis validation. Nature Methods 21(2), 182-194. </w:t>
       </w:r>
-      <w:hyperlink w:history="1" r:id="rIdeosiezuxvxoatpjyqxrng">
+      <w:hyperlink w:history="1" r:id="rIdlqlft_tjmilh0bfid0fyk">
         <w:r>
           <w:rPr>
             <w:rFonts w:ascii="Times New Roman" w:cs="Times New Roman" w:eastAsia="Times New Roman" w:hAnsi="Times New Roman"/>
@@ -13196,7 +13196,7 @@
         </w:rPr>
         <w:t xml:space="preserve">Ronneberger, O., Fischer, P., Brox, T., 2015. U-Net: Convolutional networks for biomedical image segmentation. In: Medical Image Computing and Computer-Assisted Intervention, MICCAI 2015. Lecture Notes in Computer Science 9351, pp. 234-241. </w:t>
       </w:r>
-      <w:hyperlink w:history="1" r:id="rIdjxlzx2u20lsk1zmrourly">
+      <w:hyperlink w:history="1" r:id="rId-4lokqxhjyazxbtbqy8c7">
         <w:r>
           <w:rPr>
             <w:rFonts w:ascii="Times New Roman" w:cs="Times New Roman" w:eastAsia="Times New Roman" w:hAnsi="Times New Roman"/>
@@ -13224,7 +13224,7 @@
         </w:rPr>
         <w:t xml:space="preserve">Sandler, M., Howard, A., Zhu, M., Zhmoginov, A., Chen, L.-C., 2018. MobileNetV2: Inverted residuals and linear bottlenecks. In: Proceedings of the IEEE/CVF Conference on Computer Vision and Pattern Recognition (CVPR), pp. 4510-4520. </w:t>
       </w:r>
-      <w:hyperlink w:history="1" r:id="rIdffim8hlbdc-f2yeeccdhj">
+      <w:hyperlink w:history="1" r:id="rIdsklgv71ojdqmxuzchzowj">
         <w:r>
           <w:rPr>
             <w:rFonts w:ascii="Times New Roman" w:cs="Times New Roman" w:eastAsia="Times New Roman" w:hAnsi="Times New Roman"/>
@@ -13252,7 +13252,7 @@
         </w:rPr>
         <w:t xml:space="preserve">Sarp, S., Kuzlu, M., Wilson, E., Guler, O., 2021. WG2AN: Synthetic wound image generation using generative adversarial network. The Journal of Engineering 2021(5), 286-294. </w:t>
       </w:r>
-      <w:hyperlink w:history="1" r:id="rIdldhvhuenadr5aayfiiegc">
+      <w:hyperlink w:history="1" r:id="rIdkyvho8kenebap1nbsvm6-">
         <w:r>
           <w:rPr>
             <w:rFonts w:ascii="Times New Roman" w:cs="Times New Roman" w:eastAsia="Times New Roman" w:hAnsi="Times New Roman"/>
@@ -13280,7 +13280,7 @@
         </w:rPr>
         <w:t xml:space="preserve">Shoshan, A., Bhonker, N., Kviatkovsky, I., Fintz, M., Medioni, G., 2023. Synthetic data for model selection. In: Proceedings of the 40th International Conference on Machine Learning (ICML 2023), PMLR 202, pp. 31633-31656. </w:t>
       </w:r>
-      <w:hyperlink w:history="1" r:id="rId7yatxzh0w0bxpjou2_e1r">
+      <w:hyperlink w:history="1" r:id="rIdoco9i5soffxnbk599vb1s">
         <w:r>
           <w:rPr>
             <w:rFonts w:ascii="Times New Roman" w:cs="Times New Roman" w:eastAsia="Times New Roman" w:hAnsi="Times New Roman"/>
@@ -13308,7 +13308,7 @@
         </w:rPr>
         <w:t xml:space="preserve">Silva, J., Histace, A., Romain, O., Dray, X., Granado, B., 2014. Toward embedded detection of polyps in WCE images for early diagnosis of colorectal cancer. International Journal of Computer Assisted Radiology and Surgery 9(2), 283-293. </w:t>
       </w:r>
-      <w:hyperlink w:history="1" r:id="rIdloogdnxatqsbpmsemeup_">
+      <w:hyperlink w:history="1" r:id="rId2da05ppowqrkhxhbtpocz">
         <w:r>
           <w:rPr>
             <w:rFonts w:ascii="Times New Roman" w:cs="Times New Roman" w:eastAsia="Times New Roman" w:hAnsi="Times New Roman"/>
@@ -13336,7 +13336,7 @@
         </w:rPr>
         <w:t xml:space="preserve">Tan, M., Le, Q., 2019. EfficientNet: Rethinking model scaling for convolutional neural networks. In: Proceedings of the 36th International Conference on Machine Learning (ICML 2019), PMLR 97, pp. 6105-6114. </w:t>
       </w:r>
-      <w:hyperlink w:history="1" r:id="rIddetdgarf2sac4gvp491qp">
+      <w:hyperlink w:history="1" r:id="rIdg5jlco6zjqzsybpgnns5p">
         <w:r>
           <w:rPr>
             <w:rFonts w:ascii="Times New Roman" w:cs="Times New Roman" w:eastAsia="Times New Roman" w:hAnsi="Times New Roman"/>
@@ -13364,7 +13364,7 @@
         </w:rPr>
         <w:t xml:space="preserve">Taori, R., Dave, A., Shankar, V., Carlini, N., Recht, B., Schmidt, L., 2020. Measuring robustness to natural distribution shifts in image classification. In: Advances in Neural Information Processing Systems 33 (NeurIPS 2020), pp. 18583-18599. </w:t>
       </w:r>
-      <w:hyperlink w:history="1" r:id="rIdphm4elf10mfk5sy-3p3un">
+      <w:hyperlink w:history="1" r:id="rIdu-qeo_lufscalcmtuppgg">
         <w:r>
           <w:rPr>
             <w:rFonts w:ascii="Times New Roman" w:cs="Times New Roman" w:eastAsia="Times New Roman" w:hAnsi="Times New Roman"/>
@@ -13392,7 +13392,7 @@
         </w:rPr>
         <w:t xml:space="preserve">Teney, D., Lin, Y., Oh, S.J., Abbasnejad, E., 2023. ID and OOD performance are sometimes inversely correlated on real-world datasets. In: Advances in Neural Information Processing Systems 36 (NeurIPS 2023). </w:t>
       </w:r>
-      <w:hyperlink w:history="1" r:id="rId7r3qr-f_dapjxjnzfd_fc">
+      <w:hyperlink w:history="1" r:id="rIdbkple9zglnixc9t0dli1t">
         <w:r>
           <w:rPr>
             <w:rFonts w:ascii="Times New Roman" w:cs="Times New Roman" w:eastAsia="Times New Roman" w:hAnsi="Times New Roman"/>
@@ -13420,7 +13420,7 @@
         </w:rPr>
         <w:t xml:space="preserve">Tobin, J., Fong, R., Ray, A., Schneider, J., Zaremba, W., Abbeel, P., 2017. Domain randomization for transferring deep neural networks from simulation to the real world. In: 2017 IEEE/RSJ International Conference on Intelligent Robots and Systems (IROS), pp. 23-30. </w:t>
       </w:r>
-      <w:hyperlink w:history="1" r:id="rId9jtt65rqdj-ikr6gd8u7g">
+      <w:hyperlink w:history="1" r:id="rIdojrxmgralh1vagjtnssgl">
         <w:r>
           <w:rPr>
             <w:rFonts w:ascii="Times New Roman" w:cs="Times New Roman" w:eastAsia="Times New Roman" w:hAnsi="Times New Roman"/>
@@ -13448,7 +13448,7 @@
         </w:rPr>
         <w:t xml:space="preserve">Torralba, A., Efros, A.A., 2011. Unbiased look at dataset bias. In: Proceedings of the IEEE Conference on Computer Vision and Pattern Recognition (CVPR), pp. 1521-1528. </w:t>
       </w:r>
-      <w:hyperlink w:history="1" r:id="rIdhhqolejkyhx67egfveu0-">
+      <w:hyperlink w:history="1" r:id="rIdm_1vdfde8thjehjoqx2ew">
         <w:r>
           <w:rPr>
             <w:rFonts w:ascii="Times New Roman" w:cs="Times New Roman" w:eastAsia="Times New Roman" w:hAnsi="Times New Roman"/>
@@ -13476,7 +13476,7 @@
         </w:rPr>
         <w:t xml:space="preserve">Tremblay, J., Prakash, A., Acuna, D., et al., 2018. Training deep networks with synthetic data: Bridging the reality gap by domain randomization. In: IEEE/CVF Conference on Computer Vision and Pattern Recognition Workshops (CVPRW), pp. 969-977. </w:t>
       </w:r>
-      <w:hyperlink w:history="1" r:id="rIdmnl4itah7as7dlj7ewvwe">
+      <w:hyperlink w:history="1" r:id="rIda1viwm-qmiuyjojb8caqs">
         <w:r>
           <w:rPr>
             <w:rFonts w:ascii="Times New Roman" w:cs="Times New Roman" w:eastAsia="Times New Roman" w:hAnsi="Times New Roman"/>
@@ -13504,7 +13504,7 @@
         </w:rPr>
         <w:t xml:space="preserve">van Breugel, B., Seedat, N., Imrie, F., van der Schaar, M., 2023. Can you rely on your model evaluation? Improving model evaluation with synthetic test data. arXiv preprint. </w:t>
       </w:r>
-      <w:hyperlink w:history="1" r:id="rIdizjwc0muqxrluyq0vck5o">
+      <w:hyperlink w:history="1" r:id="rIdo63zhfb1inp1puwr4pagj">
         <w:r>
           <w:rPr>
             <w:rFonts w:ascii="Times New Roman" w:cs="Times New Roman" w:eastAsia="Times New Roman" w:hAnsi="Times New Roman"/>
@@ -13532,7 +13532,7 @@
         </w:rPr>
         <w:t xml:space="preserve">Wang, C., Anisuzzaman, D.M., Williamson, V., et al., 2020. Fully automatic wound segmentation with deep convolutional neural networks. Scientific Reports 10, 21897. </w:t>
       </w:r>
-      <w:hyperlink w:history="1" r:id="rIdh5s-xzxmtruu8zduj9gmb">
+      <w:hyperlink w:history="1" r:id="rIdypfsrwbdtm4sgx2fyogzj">
         <w:r>
           <w:rPr>
             <w:rFonts w:ascii="Times New Roman" w:cs="Times New Roman" w:eastAsia="Times New Roman" w:hAnsi="Times New Roman"/>
@@ -13560,7 +13560,7 @@
         </w:rPr>
         <w:t xml:space="preserve">Wang, C., Mahbod, A., Ellinger, I., Galdran, A., Gopalakrishnan, S., Niezgoda, J., Yu, Z., 2024. FUSeg: The Foot Ulcer Segmentation Challenge. Information 15(3), 140. </w:t>
       </w:r>
-      <w:hyperlink w:history="1" r:id="rIdyx8kc4i31pteymfatckgs">
+      <w:hyperlink w:history="1" r:id="rIddpd5gjbciukixrtxsei9e">
         <w:r>
           <w:rPr>
             <w:rFonts w:ascii="Times New Roman" w:cs="Times New Roman" w:eastAsia="Times New Roman" w:hAnsi="Times New Roman"/>
@@ -13588,7 +13588,7 @@
         </w:rPr>
         <w:t xml:space="preserve">Wiesenfarth, M., Reinke, A., Landman, B.A., et al., 2021. Methods and open-source toolkit for analyzing and visualizing challenge results. Scientific Reports 11, 2369. </w:t>
       </w:r>
-      <w:hyperlink w:history="1" r:id="rIdgvc6xsq-fsrhmacrje1vx">
+      <w:hyperlink w:history="1" r:id="rIdiz8rmqsm5iyj_113rhguk">
         <w:r>
           <w:rPr>
             <w:rFonts w:ascii="Times New Roman" w:cs="Times New Roman" w:eastAsia="Times New Roman" w:hAnsi="Times New Roman"/>
@@ -13616,7 +13616,7 @@
         </w:rPr>
         <w:t xml:space="preserve">Xie, E., Wang, W., Yu, Z., Anandkumar, A., Alvarez, J.M., Luo, P., 2021. SegFormer: Simple and efficient design for semantic segmentation with transformers. In: Advances in Neural Information Processing Systems 34 (NeurIPS 2021), pp. 12077-12090. </w:t>
       </w:r>
-      <w:hyperlink w:history="1" r:id="rIdm80vcrzjteytb-bfgy76l">
+      <w:hyperlink w:history="1" r:id="rIdzx3xe1uyfu6afy7mlxmvo">
         <w:r>
           <w:rPr>
             <w:rFonts w:ascii="Times New Roman" w:cs="Times New Roman" w:eastAsia="Times New Roman" w:hAnsi="Times New Roman"/>
@@ -13644,7 +13644,7 @@
         </w:rPr>
         <w:t xml:space="preserve">Yap, M.H., Cassidy, B., Byra, M., et al., 2024. Diabetic foot ulcers segmentation challenge report: Benchmark and analysis. Medical Image Analysis 94, 103153. </w:t>
       </w:r>
-      <w:hyperlink w:history="1" r:id="rIdbvqefal-vfpgmvvewnua2">
+      <w:hyperlink w:history="1" r:id="rIdl20icdhwdhp0nb-8hgimo">
         <w:r>
           <w:rPr>
             <w:rFonts w:ascii="Times New Roman" w:cs="Times New Roman" w:eastAsia="Times New Roman" w:hAnsi="Times New Roman"/>
@@ -13672,7 +13672,7 @@
         </w:rPr>
         <w:t xml:space="preserve">Zhang, G., Dominguez-Olmedo, R., Hardt, M., 2026. Train-before-test harmonizes language model rankings. In: International Conference on Learning Representations (ICLR 2026). </w:t>
       </w:r>
-      <w:hyperlink w:history="1" r:id="rIdeaoszaaiumkyav8d4anru">
+      <w:hyperlink w:history="1" r:id="rIdvf80j3uy3mkrolmhdqa2a">
         <w:r>
           <w:rPr>
             <w:rFonts w:ascii="Times New Roman" w:cs="Times New Roman" w:eastAsia="Times New Roman" w:hAnsi="Times New Roman"/>
@@ -13700,7 +13700,7 @@
         </w:rPr>
         <w:t xml:space="preserve">Zhang, R., Tian, D., Xu, D., Qian, W., Yao, Y., 2022. A survey of wound image analysis using deep learning: Classification, detection, and segmentation. IEEE Access 10, 79502-79515. </w:t>
       </w:r>
-      <w:hyperlink w:history="1" r:id="rIdhxven0ydduerkntavs7ea">
+      <w:hyperlink w:history="1" r:id="rIdjp2pz0wq6san0pdqwhhbf">
         <w:r>
           <w:rPr>
             <w:rFonts w:ascii="Times New Roman" w:cs="Times New Roman" w:eastAsia="Times New Roman" w:hAnsi="Times New Roman"/>
@@ -13728,7 +13728,7 @@
         </w:rPr>
         <w:t xml:space="preserve">Zhao, H., Shi, J., Qi, X., Wang, X., Jia, J., 2017. Pyramid scene parsing network. In: Proceedings of the IEEE Conference on Computer Vision and Pattern Recognition (CVPR), pp. 6230-6239. </w:t>
       </w:r>
-      <w:hyperlink w:history="1" r:id="rIdywnfpyuzpvxqfsm1lhxrl">
+      <w:hyperlink w:history="1" r:id="rId_xrrhu_vkrqombqcoluy8">
         <w:r>
           <w:rPr>
             <w:rFonts w:ascii="Times New Roman" w:cs="Times New Roman" w:eastAsia="Times New Roman" w:hAnsi="Times New Roman"/>
@@ -13756,7 +13756,7 @@
         </w:rPr>
         <w:t xml:space="preserve">Zhou, Z., Siddiquee, M.M.R., Tajbakhsh, N., Liang, J., 2018. UNet++: A nested U-Net architecture for medical image segmentation. In: Deep Learning in Medical Image Analysis and Multimodal Learning for Clinical Decision Support. Lecture Notes in Computer Science 11045, pp. 3-11. </w:t>
       </w:r>
-      <w:hyperlink w:history="1" r:id="rIdmohtqvgqrpnmiup9vi0sm">
+      <w:hyperlink w:history="1" r:id="rIdkljjmqwuhqymnneczjmxd">
         <w:r>
           <w:rPr>
             <w:rFonts w:ascii="Times New Roman" w:cs="Times New Roman" w:eastAsia="Times New Roman" w:hAnsi="Times New Roman"/>

</xml_diff>